<commit_message>
Baco B-03: Luigi non vede la scritta CYF sul trampolino gigante (R-240); prova con foto per stanotte (prossimi passi 1f)
Co-Authored-By: Claude Opus 5.5 <noreply@anthropic.com>
Claude-Session: https://claude.ai/code/session_017ipzp9sqryzfFBJaHpW6iC
</commit_message>
<xml_diff>
--- a/docs/CYF-Gaming-Requisiti-da-Implementare-o-Bachi.docx
+++ b/docs/CYF-Gaming-Requisiti-da-Implementare-o-Bachi.docx
@@ -3515,6 +3515,116 @@
               <w:rPr>
                 <w:sz w:val="19"/>
               </w:rPr>
+              <w:t xml:space="preserve">1f</w:t>
+            </w:r>
+          </w:p>
+        </w:tc>
+        <w:tc>
+          <w:tcPr>
+            <w:tcW w:type="dxa" w:w="3175"/>
+          </w:tcPr>
+          <w:p>
+            <w:pPr>
+              <w:pStyle w:val="Compact"/>
+              <w:spacing w:after="40"/>
+              <w:jc w:val="left"/>
+            </w:pPr>
+            <w:r>
+              <w:rPr>
+                <w:sz w:val="19"/>
+              </w:rPr>
+              <w:t xml:space="preserve">Baco B-03: verificare con una foto che la scritta CYF si veda sui trampolini giganti (neve e una città), aggiungere la prova al giro completo e correggere se non si vede</w:t>
+            </w:r>
+          </w:p>
+        </w:tc>
+        <w:tc>
+          <w:tcPr>
+            <w:tcW w:type="dxa" w:w="2494"/>
+          </w:tcPr>
+          <w:p>
+            <w:pPr>
+              <w:pStyle w:val="Compact"/>
+              <w:spacing w:after="40"/>
+              <w:jc w:val="left"/>
+            </w:pPr>
+            <w:r>
+              <w:rPr>
+                <w:sz w:val="19"/>
+              </w:rPr>
+              <w:t xml:space="preserve">Luigi non la vede (27/10 sera)</w:t>
+            </w:r>
+          </w:p>
+        </w:tc>
+        <w:tc>
+          <w:tcPr>
+            <w:tcW w:type="dxa" w:w="1247"/>
+          </w:tcPr>
+          <w:p>
+            <w:pPr>
+              <w:pStyle w:val="Compact"/>
+              <w:spacing w:after="40"/>
+              <w:jc w:val="left"/>
+            </w:pPr>
+            <w:r>
+              <w:rPr>
+                <w:sz w:val="19"/>
+              </w:rPr>
+              <w:t xml:space="preserve">B-03, R-240</w:t>
+            </w:r>
+          </w:p>
+        </w:tc>
+        <w:tc>
+          <w:tcPr>
+            <w:tcW w:type="dxa" w:w="1134"/>
+          </w:tcPr>
+          <w:p>
+            <w:pPr>
+              <w:pStyle w:val="Compact"/>
+              <w:spacing w:after="40"/>
+              <w:jc w:val="left"/>
+            </w:pPr>
+            <w:r>
+              <w:rPr>
+                <w:sz w:val="19"/>
+              </w:rPr>
+              <w:t xml:space="preserve">—</w:t>
+            </w:r>
+          </w:p>
+        </w:tc>
+        <w:tc>
+          <w:tcPr>
+            <w:tcW w:type="dxa" w:w="1304"/>
+          </w:tcPr>
+          <w:p>
+            <w:pPr>
+              <w:pStyle w:val="Compact"/>
+              <w:spacing w:after="40"/>
+              <w:jc w:val="left"/>
+            </w:pPr>
+            <w:r>
+              <w:rPr>
+                <w:sz w:val="19"/>
+              </w:rPr>
+              <w:t xml:space="preserve">Sì (stanotte)</w:t>
+            </w:r>
+          </w:p>
+        </w:tc>
+      </w:tr>
+      <w:tr>
+        <w:tc>
+          <w:tcPr>
+            <w:tcW w:type="dxa" w:w="510"/>
+          </w:tcPr>
+          <w:p>
+            <w:pPr>
+              <w:pStyle w:val="Compact"/>
+              <w:spacing w:after="40"/>
+              <w:jc w:val="left"/>
+            </w:pPr>
+            <w:r>
+              <w:rPr>
+                <w:sz w:val="19"/>
+              </w:rPr>
               <w:t xml:space="preserve">2</w:t>
             </w:r>
           </w:p>
@@ -5147,6 +5257,137 @@
                 <w:sz w:val="19"/>
               </w:rPr>
               <w:t xml:space="preserve">): anche la pagina senza versione si ricarica. Da provare e pubblicare stanotte (variante di R1c)</w:t>
+            </w:r>
+          </w:p>
+        </w:tc>
+      </w:tr>
+      <w:tr>
+        <w:tc>
+          <w:tcPr>
+            <w:tcW w:type="dxa" w:w="794"/>
+          </w:tcPr>
+          <w:p>
+            <w:pPr>
+              <w:pStyle w:val="Compact"/>
+              <w:spacing w:after="40"/>
+              <w:jc w:val="left"/>
+            </w:pPr>
+            <w:r>
+              <w:rPr>
+                <w:sz w:val="19"/>
+              </w:rPr>
+              <w:t xml:space="preserve">B-03</w:t>
+            </w:r>
+          </w:p>
+        </w:tc>
+        <w:tc>
+          <w:tcPr>
+            <w:tcW w:type="dxa" w:w="3402"/>
+          </w:tcPr>
+          <w:p>
+            <w:pPr>
+              <w:pStyle w:val="Compact"/>
+              <w:spacing w:after="40"/>
+              <w:jc w:val="left"/>
+            </w:pPr>
+            <w:r>
+              <w:rPr>
+                <w:sz w:val="19"/>
+              </w:rPr>
+              <w:t xml:space="preserve">Luigi non vede la scritta CYF sul trampolino gigante (R-240), segnalato il 27/10 alle 22:41</w:t>
+            </w:r>
+          </w:p>
+        </w:tc>
+        <w:tc>
+          <w:tcPr>
+            <w:tcW w:type="dxa" w:w="1134"/>
+          </w:tcPr>
+          <w:p>
+            <w:pPr>
+              <w:pStyle w:val="Compact"/>
+              <w:spacing w:after="40"/>
+              <w:jc w:val="left"/>
+            </w:pPr>
+            <w:r>
+              <w:rPr>
+                <w:sz w:val="19"/>
+              </w:rPr>
+              <w:t xml:space="preserve">27/10/2026</w:t>
+            </w:r>
+          </w:p>
+        </w:tc>
+        <w:tc>
+          <w:tcPr>
+            <w:tcW w:type="dxa" w:w="1020"/>
+            <w:shd w:val="clear" w:color="auto" w:fill="FDE2D6"/>
+          </w:tcPr>
+          <w:p>
+            <w:pPr>
+              <w:pStyle w:val="Compact"/>
+              <w:spacing w:after="40"/>
+              <w:jc w:val="left"/>
+            </w:pPr>
+            <w:r>
+              <w:rPr>
+                <w:sz w:val="19"/>
+              </w:rPr>
+              <w:t xml:space="preserve">Da fare</w:t>
+            </w:r>
+          </w:p>
+        </w:tc>
+        <w:tc>
+          <w:tcPr>
+            <w:tcW w:type="dxa" w:w="3515"/>
+          </w:tcPr>
+          <w:p>
+            <w:pPr>
+              <w:pStyle w:val="Compact"/>
+              <w:spacing w:after="40"/>
+              <w:jc w:val="left"/>
+            </w:pPr>
+            <w:r>
+              <w:rPr>
+                <w:sz w:val="19"/>
+              </w:rPr>
+              <w:t xml:space="preserve">Da capire. Nel codice c’è dalla 0.19.0 (</w:t>
+            </w:r>
+            <w:r>
+              <w:rPr>
+                <w:rStyle w:val="VerbatimChar"/>
+                <w:sz w:val="19"/>
+              </w:rPr>
+              <w:t xml:space="preserve">scrittaCYF</w:t>
+            </w:r>
+            <w:r>
+              <w:rPr>
+                <w:sz w:val="19"/>
+              </w:rPr>
+              <w:t xml:space="preserve"> </w:t>
+            </w:r>
+            <w:r>
+              <w:rPr>
+                <w:sz w:val="19"/>
+              </w:rPr>
+              <w:t xml:space="preserve">in</w:t>
+            </w:r>
+            <w:r>
+              <w:rPr>
+                <w:sz w:val="19"/>
+              </w:rPr>
+              <w:t xml:space="preserve"> </w:t>
+            </w:r>
+            <w:r>
+              <w:rPr>
+                <w:rStyle w:val="VerbatimChar"/>
+                <w:sz w:val="19"/>
+              </w:rPr>
+              <w:t xml:space="preserve">moduli/generazione.js</w:t>
+            </w:r>
+            <w:r>
+              <w:rPr>
+                <w:sz w:val="19"/>
+              </w:rPr>
+              <w:t xml:space="preserve">): un foglio con CYF arancione su blu notte che segue la salita dei soli trampolini giganti (circa 1 rampa su 7; le rampe normali non l’hanno), su neve e città; a una lettura del codice posizione, verso di lettura e altezza (3 cm sopra la superficie) sono giusti. Nessuna prova controlla che si veda. Ipotesi: il telefono apre una pagina vecchia (come B-01 e B-02, stesso Samsung Internet), oppure la scritta resta nascosta sotto la superficie della rampa in qualche scenario. Stanotte: prova nuova con foto di un trampolino gigante sulla neve e in una città vista dal giocatore che arriva, e controllo che la scritta esista e stia sopra la superficie; se non si vede, correzione</w:t>
             </w:r>
           </w:p>
         </w:tc>

</xml_diff>

<commit_message>
R-513: grafica degli scenari al livello 2, prima lo sfondo (scelta di Luigi del 27/10); coda delle 17: sfondo, A-14 con fps veri e qualità automatica, A-16 Three.js nuovo, resto del livello 2 (approvati)
Co-Authored-By: Claude Opus 5.5 <noreply@anthropic.com>
Claude-Session: https://claude.ai/code/session_017ipzp9sqryzfFBJaHpW6iC
</commit_message>
<xml_diff>
--- a/docs/CYF-Gaming-Requisiti-da-Implementare-o-Bachi.docx
+++ b/docs/CYF-Gaming-Requisiti-da-Implementare-o-Bachi.docx
@@ -123,7 +123,55 @@
         <w:t xml:space="preserve"> </w:t>
       </w:r>
       <w:r>
-        <w:t xml:space="preserve">22:45</w:t>
+        <w:t xml:space="preserve">22:55</w:t>
+      </w:r>
+      <w:r>
+        <w:t xml:space="preserve"> </w:t>
+      </w:r>
+      <w:r>
+        <w:t xml:space="preserve">·</w:t>
+      </w:r>
+      <w:r>
+        <w:t xml:space="preserve"> </w:t>
+      </w:r>
+      <w:r>
+        <w:t xml:space="preserve">grafica</w:t>
+      </w:r>
+      <w:r>
+        <w:t xml:space="preserve"> </w:t>
+      </w:r>
+      <w:r>
+        <w:t xml:space="preserve">al</w:t>
+      </w:r>
+      <w:r>
+        <w:t xml:space="preserve"> </w:t>
+      </w:r>
+      <w:r>
+        <w:t xml:space="preserve">livello</w:t>
+      </w:r>
+      <w:r>
+        <w:t xml:space="preserve"> </w:t>
+      </w:r>
+      <w:r>
+        <w:t xml:space="preserve">2,</w:t>
+      </w:r>
+      <w:r>
+        <w:t xml:space="preserve"> </w:t>
+      </w:r>
+      <w:r>
+        <w:t xml:space="preserve">prima</w:t>
+      </w:r>
+      <w:r>
+        <w:t xml:space="preserve"> </w:t>
+      </w:r>
+      <w:r>
+        <w:t xml:space="preserve">lo</w:t>
+      </w:r>
+      <w:r>
+        <w:t xml:space="preserve"> </w:t>
+      </w:r>
+      <w:r>
+        <w:t xml:space="preserve">sfondo</w:t>
       </w:r>
       <w:r>
         <w:t xml:space="preserve"> </w:t>
@@ -398,7 +446,7 @@
         <w:pStyle w:val="FirstParagraph"/>
       </w:pPr>
       <w:r>
-        <w:t xml:space="preserve">Aggiornati il 27/10/2026 alle 22:45 (versione online: 0.20.2; la 0.21.0 con</w:t>
+        <w:t xml:space="preserve">Aggiornati il 27/10/2026 alle 22:55 (versione online: 0.20.2; la 0.21.0 con</w:t>
       </w:r>
       <w:r>
         <w:t xml:space="preserve"> </w:t>
@@ -3641,9 +3689,23 @@
             </w:pPr>
             <w:r>
               <w:rPr>
-                <w:sz w:val="19"/>
-              </w:rPr>
-              <w:t xml:space="preserve">Prestazioni misurate ogni notte, con soglie (fps, peso della pagina, caricamento)</w:t>
+                <w:bCs/>
+                <w:b/>
+                <w:sz w:val="19"/>
+              </w:rPr>
+              <w:t xml:space="preserve">Sfondo al livello 2</w:t>
+            </w:r>
+            <w:r>
+              <w:rPr>
+                <w:sz w:val="19"/>
+              </w:rPr>
+              <w:t xml:space="preserve"> </w:t>
+            </w:r>
+            <w:r>
+              <w:rPr>
+                <w:sz w:val="19"/>
+              </w:rPr>
+              <w:t xml:space="preserve">(prima parte di R-513): cielo con nuvole e sole, cartolina divisa in 2-3 piani con la profondità, luce coerente con il sole, passaggio morbido tra pista e sfondo, Neve con sfondo dipinto, piccoli movimenti. Prove da aggiungere la notte: foto di ogni città da 2 punti della pista, tempo di pittura nel worker, memoria della scheda video</w:t>
             </w:r>
           </w:p>
         </w:tc>
@@ -3661,7 +3723,31 @@
               <w:rPr>
                 <w:sz w:val="19"/>
               </w:rPr>
-              <w:t xml:space="preserve">Si vede subito se una novità rallenta il gioco</w:t>
+              <w:t xml:space="preserve">Scelta di Luigi del 27/10:</w:t>
+            </w:r>
+            <w:r>
+              <w:rPr>
+                <w:sz w:val="19"/>
+              </w:rPr>
+              <w:t xml:space="preserve"> </w:t>
+            </w:r>
+            <w:r>
+              <w:rPr>
+                <w:sz w:val="19"/>
+              </w:rPr>
+              <w:t xml:space="preserve">“</w:t>
+            </w:r>
+            <w:r>
+              <w:rPr>
+                <w:sz w:val="19"/>
+              </w:rPr>
+              <w:t xml:space="preserve">miglioriamo almeno lo sfondo</w:t>
+            </w:r>
+            <w:r>
+              <w:rPr>
+                <w:sz w:val="19"/>
+              </w:rPr>
+              <w:t xml:space="preserve">”</w:t>
             </w:r>
           </w:p>
         </w:tc>
@@ -3679,7 +3765,517 @@
               <w:rPr>
                 <w:sz w:val="19"/>
               </w:rPr>
-              <w:t xml:space="preserve">A-14</w:t>
+              <w:t xml:space="preserve">R-513, R-405</w:t>
+            </w:r>
+          </w:p>
+        </w:tc>
+        <w:tc>
+          <w:tcPr>
+            <w:tcW w:type="dxa" w:w="1134"/>
+          </w:tcPr>
+          <w:p>
+            <w:pPr>
+              <w:pStyle w:val="Compact"/>
+              <w:spacing w:after="40"/>
+              <w:jc w:val="left"/>
+            </w:pPr>
+            <w:r>
+              <w:rPr>
+                <w:sz w:val="19"/>
+              </w:rPr>
+              <w:t xml:space="preserve">—</w:t>
+            </w:r>
+          </w:p>
+        </w:tc>
+        <w:tc>
+          <w:tcPr>
+            <w:tcW w:type="dxa" w:w="1304"/>
+            <w:shd w:val="clear" w:color="auto" w:fill="D7F0DF"/>
+          </w:tcPr>
+          <w:p>
+            <w:pPr>
+              <w:pStyle w:val="Compact"/>
+              <w:spacing w:after="40"/>
+              <w:jc w:val="left"/>
+            </w:pPr>
+            <w:r>
+              <w:rPr>
+                <w:sz w:val="19"/>
+              </w:rPr>
+              <w:t xml:space="preserve">Sì</w:t>
+            </w:r>
+          </w:p>
+        </w:tc>
+      </w:tr>
+      <w:tr>
+        <w:tc>
+          <w:tcPr>
+            <w:tcW w:type="dxa" w:w="510"/>
+          </w:tcPr>
+          <w:p>
+            <w:pPr>
+              <w:pStyle w:val="Compact"/>
+              <w:spacing w:after="40"/>
+              <w:jc w:val="left"/>
+            </w:pPr>
+            <w:r>
+              <w:rPr>
+                <w:sz w:val="19"/>
+              </w:rPr>
+              <w:t xml:space="preserve">3</w:t>
+            </w:r>
+          </w:p>
+        </w:tc>
+        <w:tc>
+          <w:tcPr>
+            <w:tcW w:type="dxa" w:w="3175"/>
+          </w:tcPr>
+          <w:p>
+            <w:pPr>
+              <w:pStyle w:val="Compact"/>
+              <w:spacing w:after="40"/>
+              <w:jc w:val="left"/>
+            </w:pPr>
+            <w:r>
+              <w:rPr>
+                <w:sz w:val="19"/>
+              </w:rPr>
+              <w:t xml:space="preserve">Prestazioni misurate: fps, peso della pagina e caricamento a ogni giro notturno, con soglie; in più gli</w:t>
+            </w:r>
+            <w:r>
+              <w:rPr>
+                <w:sz w:val="19"/>
+              </w:rPr>
+              <w:t xml:space="preserve"> </w:t>
+            </w:r>
+            <w:r>
+              <w:rPr>
+                <w:bCs/>
+                <w:b/>
+                <w:sz w:val="19"/>
+              </w:rPr>
+              <w:t xml:space="preserve">fps veri dei giocatori</w:t>
+            </w:r>
+            <w:r>
+              <w:rPr>
+                <w:sz w:val="19"/>
+              </w:rPr>
+              <w:t xml:space="preserve"> </w:t>
+            </w:r>
+            <w:r>
+              <w:rPr>
+                <w:sz w:val="19"/>
+              </w:rPr>
+              <w:t xml:space="preserve">(il gioco manda la media con la visita, divisa tra telefono e PC, su /api/stats) e la</w:t>
+            </w:r>
+            <w:r>
+              <w:rPr>
+                <w:sz w:val="19"/>
+              </w:rPr>
+              <w:t xml:space="preserve"> </w:t>
+            </w:r>
+            <w:r>
+              <w:rPr>
+                <w:bCs/>
+                <w:b/>
+                <w:sz w:val="19"/>
+              </w:rPr>
+              <w:t xml:space="preserve">qualità scelta in automatico</w:t>
+            </w:r>
+            <w:r>
+              <w:rPr>
+                <w:sz w:val="19"/>
+              </w:rPr>
+              <w:t xml:space="preserve"> </w:t>
+            </w:r>
+            <w:r>
+              <w:rPr>
+                <w:sz w:val="19"/>
+              </w:rPr>
+              <w:t xml:space="preserve">(alta, media, bassa) in base al dispositivo</w:t>
+            </w:r>
+          </w:p>
+        </w:tc>
+        <w:tc>
+          <w:tcPr>
+            <w:tcW w:type="dxa" w:w="2494"/>
+          </w:tcPr>
+          <w:p>
+            <w:pPr>
+              <w:pStyle w:val="Compact"/>
+              <w:spacing w:after="40"/>
+              <w:jc w:val="left"/>
+            </w:pPr>
+            <w:r>
+              <w:rPr>
+                <w:sz w:val="19"/>
+              </w:rPr>
+              <w:t xml:space="preserve">La grafica più bella non deve rallentare i telefoni vecchi; le prove della notte girano su un processore simulato, i telefoni veri sono un’altra cosa</w:t>
+            </w:r>
+          </w:p>
+        </w:tc>
+        <w:tc>
+          <w:tcPr>
+            <w:tcW w:type="dxa" w:w="1247"/>
+          </w:tcPr>
+          <w:p>
+            <w:pPr>
+              <w:pStyle w:val="Compact"/>
+              <w:spacing w:after="40"/>
+              <w:jc w:val="left"/>
+            </w:pPr>
+            <w:r>
+              <w:rPr>
+                <w:sz w:val="19"/>
+              </w:rPr>
+              <w:t xml:space="preserve">A-14, R-513</w:t>
+            </w:r>
+          </w:p>
+        </w:tc>
+        <w:tc>
+          <w:tcPr>
+            <w:tcW w:type="dxa" w:w="1134"/>
+          </w:tcPr>
+          <w:p>
+            <w:pPr>
+              <w:pStyle w:val="Compact"/>
+              <w:spacing w:after="40"/>
+              <w:jc w:val="left"/>
+            </w:pPr>
+            <w:r>
+              <w:rPr>
+                <w:sz w:val="19"/>
+              </w:rPr>
+              <w:t xml:space="preserve">—</w:t>
+            </w:r>
+          </w:p>
+        </w:tc>
+        <w:tc>
+          <w:tcPr>
+            <w:tcW w:type="dxa" w:w="1304"/>
+            <w:shd w:val="clear" w:color="auto" w:fill="D7F0DF"/>
+          </w:tcPr>
+          <w:p>
+            <w:pPr>
+              <w:pStyle w:val="Compact"/>
+              <w:spacing w:after="40"/>
+              <w:jc w:val="left"/>
+            </w:pPr>
+            <w:r>
+              <w:rPr>
+                <w:sz w:val="19"/>
+              </w:rPr>
+              <w:t xml:space="preserve">Sì</w:t>
+            </w:r>
+          </w:p>
+        </w:tc>
+      </w:tr>
+      <w:tr>
+        <w:tc>
+          <w:tcPr>
+            <w:tcW w:type="dxa" w:w="510"/>
+          </w:tcPr>
+          <w:p>
+            <w:pPr>
+              <w:pStyle w:val="Compact"/>
+              <w:spacing w:after="40"/>
+              <w:jc w:val="left"/>
+            </w:pPr>
+            <w:r>
+              <w:rPr>
+                <w:sz w:val="19"/>
+              </w:rPr>
+              <w:t xml:space="preserve">4</w:t>
+            </w:r>
+          </w:p>
+        </w:tc>
+        <w:tc>
+          <w:tcPr>
+            <w:tcW w:type="dxa" w:w="3175"/>
+          </w:tcPr>
+          <w:p>
+            <w:pPr>
+              <w:pStyle w:val="Compact"/>
+              <w:spacing w:after="40"/>
+              <w:jc w:val="left"/>
+            </w:pPr>
+            <w:r>
+              <w:rPr>
+                <w:sz w:val="19"/>
+              </w:rPr>
+              <w:t xml:space="preserve">Three.js nuova versione (oggi r128 del 2021, ultima r186 di settembre 2026); dove WebGPU manca torna da sola a WebGL 2</w:t>
+            </w:r>
+          </w:p>
+        </w:tc>
+        <w:tc>
+          <w:tcPr>
+            <w:tcW w:type="dxa" w:w="2494"/>
+          </w:tcPr>
+          <w:p>
+            <w:pPr>
+              <w:pStyle w:val="Compact"/>
+              <w:spacing w:after="40"/>
+              <w:jc w:val="left"/>
+            </w:pPr>
+            <w:r>
+              <w:rPr>
+                <w:sz w:val="19"/>
+              </w:rPr>
+              <w:t xml:space="preserve">Serve al livello 2 (luce, colori, texture compresse); cambiano colori e luci: la notte ricontrolla tutte le città con le foto</w:t>
+            </w:r>
+          </w:p>
+        </w:tc>
+        <w:tc>
+          <w:tcPr>
+            <w:tcW w:type="dxa" w:w="1247"/>
+          </w:tcPr>
+          <w:p>
+            <w:pPr>
+              <w:pStyle w:val="Compact"/>
+              <w:spacing w:after="40"/>
+              <w:jc w:val="left"/>
+            </w:pPr>
+            <w:r>
+              <w:rPr>
+                <w:sz w:val="19"/>
+              </w:rPr>
+              <w:t xml:space="preserve">A-16, R-513</w:t>
+            </w:r>
+          </w:p>
+        </w:tc>
+        <w:tc>
+          <w:tcPr>
+            <w:tcW w:type="dxa" w:w="1134"/>
+          </w:tcPr>
+          <w:p>
+            <w:pPr>
+              <w:pStyle w:val="Compact"/>
+              <w:spacing w:after="40"/>
+              <w:jc w:val="left"/>
+            </w:pPr>
+            <w:r>
+              <w:rPr>
+                <w:sz w:val="19"/>
+              </w:rPr>
+              <w:t xml:space="preserve">—</w:t>
+            </w:r>
+          </w:p>
+        </w:tc>
+        <w:tc>
+          <w:tcPr>
+            <w:tcW w:type="dxa" w:w="1304"/>
+            <w:shd w:val="clear" w:color="auto" w:fill="D7F0DF"/>
+          </w:tcPr>
+          <w:p>
+            <w:pPr>
+              <w:pStyle w:val="Compact"/>
+              <w:spacing w:after="40"/>
+              <w:jc w:val="left"/>
+            </w:pPr>
+            <w:r>
+              <w:rPr>
+                <w:sz w:val="19"/>
+              </w:rPr>
+              <w:t xml:space="preserve">Sì</w:t>
+            </w:r>
+          </w:p>
+        </w:tc>
+      </w:tr>
+      <w:tr>
+        <w:tc>
+          <w:tcPr>
+            <w:tcW w:type="dxa" w:w="510"/>
+          </w:tcPr>
+          <w:p>
+            <w:pPr>
+              <w:pStyle w:val="Compact"/>
+              <w:spacing w:after="40"/>
+              <w:jc w:val="left"/>
+            </w:pPr>
+            <w:r>
+              <w:rPr>
+                <w:sz w:val="19"/>
+              </w:rPr>
+              <w:t xml:space="preserve">5</w:t>
+            </w:r>
+          </w:p>
+        </w:tc>
+        <w:tc>
+          <w:tcPr>
+            <w:tcW w:type="dxa" w:w="3175"/>
+          </w:tcPr>
+          <w:p>
+            <w:pPr>
+              <w:pStyle w:val="Compact"/>
+              <w:spacing w:after="40"/>
+              <w:jc w:val="left"/>
+            </w:pPr>
+            <w:r>
+              <w:rPr>
+                <w:bCs/>
+                <w:b/>
+                <w:sz w:val="19"/>
+              </w:rPr>
+              <w:t xml:space="preserve">Resto del livello 2</w:t>
+            </w:r>
+            <w:r>
+              <w:rPr>
+                <w:sz w:val="19"/>
+              </w:rPr>
+              <w:t xml:space="preserve"> </w:t>
+            </w:r>
+            <w:r>
+              <w:rPr>
+                <w:sz w:val="19"/>
+              </w:rPr>
+              <w:t xml:space="preserve">(seconda parte di R-513): tone mapping e colori di ogni città, luce morbida, alberi e palazzi più fitti (instancing), polvere di neve, rilievo di neve e asfalto, effetti pesanti solo dove il dispositivo regge</w:t>
+            </w:r>
+          </w:p>
+        </w:tc>
+        <w:tc>
+          <w:tcPr>
+            <w:tcW w:type="dxa" w:w="2494"/>
+          </w:tcPr>
+          <w:p>
+            <w:pPr>
+              <w:pStyle w:val="Compact"/>
+              <w:spacing w:after="40"/>
+              <w:jc w:val="left"/>
+            </w:pPr>
+            <w:r>
+              <w:rPr>
+                <w:sz w:val="19"/>
+              </w:rPr>
+              <w:t xml:space="preserve">Scelta di Luigi del 27/10: livello 2</w:t>
+            </w:r>
+          </w:p>
+        </w:tc>
+        <w:tc>
+          <w:tcPr>
+            <w:tcW w:type="dxa" w:w="1247"/>
+          </w:tcPr>
+          <w:p>
+            <w:pPr>
+              <w:pStyle w:val="Compact"/>
+              <w:spacing w:after="40"/>
+              <w:jc w:val="left"/>
+            </w:pPr>
+            <w:r>
+              <w:rPr>
+                <w:sz w:val="19"/>
+              </w:rPr>
+              <w:t xml:space="preserve">R-513</w:t>
+            </w:r>
+          </w:p>
+        </w:tc>
+        <w:tc>
+          <w:tcPr>
+            <w:tcW w:type="dxa" w:w="1134"/>
+          </w:tcPr>
+          <w:p>
+            <w:pPr>
+              <w:pStyle w:val="Compact"/>
+              <w:spacing w:after="40"/>
+              <w:jc w:val="left"/>
+            </w:pPr>
+            <w:r>
+              <w:rPr>
+                <w:sz w:val="19"/>
+              </w:rPr>
+              <w:t xml:space="preserve">—</w:t>
+            </w:r>
+          </w:p>
+        </w:tc>
+        <w:tc>
+          <w:tcPr>
+            <w:tcW w:type="dxa" w:w="1304"/>
+            <w:shd w:val="clear" w:color="auto" w:fill="D7F0DF"/>
+          </w:tcPr>
+          <w:p>
+            <w:pPr>
+              <w:pStyle w:val="Compact"/>
+              <w:spacing w:after="40"/>
+              <w:jc w:val="left"/>
+            </w:pPr>
+            <w:r>
+              <w:rPr>
+                <w:sz w:val="19"/>
+              </w:rPr>
+              <w:t xml:space="preserve">Sì</w:t>
+            </w:r>
+          </w:p>
+        </w:tc>
+      </w:tr>
+      <w:tr>
+        <w:tc>
+          <w:tcPr>
+            <w:tcW w:type="dxa" w:w="510"/>
+          </w:tcPr>
+          <w:p>
+            <w:pPr>
+              <w:pStyle w:val="Compact"/>
+              <w:spacing w:after="40"/>
+              <w:jc w:val="left"/>
+            </w:pPr>
+            <w:r>
+              <w:rPr>
+                <w:sz w:val="19"/>
+              </w:rPr>
+              <w:t xml:space="preserve">6</w:t>
+            </w:r>
+          </w:p>
+        </w:tc>
+        <w:tc>
+          <w:tcPr>
+            <w:tcW w:type="dxa" w:w="3175"/>
+          </w:tcPr>
+          <w:p>
+            <w:pPr>
+              <w:pStyle w:val="Compact"/>
+              <w:spacing w:after="40"/>
+              <w:jc w:val="left"/>
+            </w:pPr>
+            <w:r>
+              <w:rPr>
+                <w:sz w:val="19"/>
+              </w:rPr>
+              <w:t xml:space="preserve">Pagina più leggera: file del gioco uniti e compressi con esbuild, città scaricate solo quando servono</w:t>
+            </w:r>
+          </w:p>
+        </w:tc>
+        <w:tc>
+          <w:tcPr>
+            <w:tcW w:type="dxa" w:w="2494"/>
+          </w:tcPr>
+          <w:p>
+            <w:pPr>
+              <w:pStyle w:val="Compact"/>
+              <w:spacing w:after="40"/>
+              <w:jc w:val="left"/>
+            </w:pPr>
+            <w:r>
+              <w:rPr>
+                <w:sz w:val="19"/>
+              </w:rPr>
+              <w:t xml:space="preserve">Il caricamento non cresce con le città nuove (e serve al livello 3, se un giorno si fa)</w:t>
+            </w:r>
+          </w:p>
+        </w:tc>
+        <w:tc>
+          <w:tcPr>
+            <w:tcW w:type="dxa" w:w="1247"/>
+          </w:tcPr>
+          <w:p>
+            <w:pPr>
+              <w:pStyle w:val="Compact"/>
+              <w:spacing w:after="40"/>
+              <w:jc w:val="left"/>
+            </w:pPr>
+            <w:r>
+              <w:rPr>
+                <w:sz w:val="19"/>
+              </w:rPr>
+              <w:t xml:space="preserve">A-23</w:t>
             </w:r>
           </w:p>
         </w:tc>
@@ -3736,7 +4332,7 @@
               <w:rPr>
                 <w:sz w:val="19"/>
               </w:rPr>
-              <w:t xml:space="preserve">3</w:t>
+              <w:t xml:space="preserve">7</w:t>
             </w:r>
           </w:p>
         </w:tc>
@@ -3754,7 +4350,7 @@
               <w:rPr>
                 <w:sz w:val="19"/>
               </w:rPr>
-              <w:t xml:space="preserve">Pagina più leggera: file del gioco uniti e compressi con esbuild, città scaricate solo quando servono</w:t>
+              <w:t xml:space="preserve">Prove divise per modulo: il cancello prova solo i moduli toccati, la notte tutto</w:t>
             </w:r>
           </w:p>
         </w:tc>
@@ -3772,7 +4368,7 @@
               <w:rPr>
                 <w:sz w:val="19"/>
               </w:rPr>
-              <w:t xml:space="preserve">Il caricamento non cresce con le città nuove</w:t>
+              <w:t xml:space="preserve">Il cancello resta veloce anche con molti moduli</w:t>
             </w:r>
           </w:p>
         </w:tc>
@@ -3790,7 +4386,7 @@
               <w:rPr>
                 <w:sz w:val="19"/>
               </w:rPr>
-              <w:t xml:space="preserve">A-23</w:t>
+              <w:t xml:space="preserve">A-25</w:t>
             </w:r>
           </w:p>
         </w:tc>
@@ -3808,7 +4404,7 @@
               <w:rPr>
                 <w:sz w:val="19"/>
               </w:rPr>
-              <w:t xml:space="preserve">0.22</w:t>
+              <w:t xml:space="preserve">—</w:t>
             </w:r>
           </w:p>
         </w:tc>
@@ -3847,7 +4443,7 @@
               <w:rPr>
                 <w:sz w:val="19"/>
               </w:rPr>
-              <w:t xml:space="preserve">4</w:t>
+              <w:t xml:space="preserve">8</w:t>
             </w:r>
           </w:p>
         </w:tc>
@@ -3865,7 +4461,26 @@
               <w:rPr>
                 <w:sz w:val="19"/>
               </w:rPr>
-              <w:t xml:space="preserve">Prove divise per modulo: il cancello prova solo i moduli toccati, la notte tutto</w:t>
+              <w:t xml:space="preserve">La rete fuori da</w:t>
+            </w:r>
+            <w:r>
+              <w:rPr>
+                <w:sz w:val="19"/>
+              </w:rPr>
+              <w:t xml:space="preserve"> </w:t>
+            </w:r>
+            <w:r>
+              <w:rPr>
+                <w:rStyle w:val="VerbatimChar"/>
+                <w:sz w:val="19"/>
+              </w:rPr>
+              <w:t xml:space="preserve">game.js</w:t>
+            </w:r>
+            <w:r>
+              <w:rPr>
+                <w:sz w:val="19"/>
+              </w:rPr>
+              <w:t xml:space="preserve">, poi controllo contro chi bara sul server (la fisica è già in un modulo solo, A-19)</w:t>
             </w:r>
           </w:p>
         </w:tc>
@@ -3883,7 +4498,31 @@
               <w:rPr>
                 <w:sz w:val="19"/>
               </w:rPr>
-              <w:t xml:space="preserve">Il cancello resta veloce anche con molti moduli</w:t>
+              <w:t xml:space="preserve">Serve alle classifiche e al link</w:t>
+            </w:r>
+            <w:r>
+              <w:rPr>
+                <w:sz w:val="19"/>
+              </w:rPr>
+              <w:t xml:space="preserve"> </w:t>
+            </w:r>
+            <w:r>
+              <w:rPr>
+                <w:sz w:val="19"/>
+              </w:rPr>
+              <w:t xml:space="preserve">“</w:t>
+            </w:r>
+            <w:r>
+              <w:rPr>
+                <w:sz w:val="19"/>
+              </w:rPr>
+              <w:t xml:space="preserve">batti il mio tempo</w:t>
+            </w:r>
+            <w:r>
+              <w:rPr>
+                <w:sz w:val="19"/>
+              </w:rPr>
+              <w:t xml:space="preserve">”</w:t>
             </w:r>
           </w:p>
         </w:tc>
@@ -3901,7 +4540,7 @@
               <w:rPr>
                 <w:sz w:val="19"/>
               </w:rPr>
-              <w:t xml:space="preserve">A-25</w:t>
+              <w:t xml:space="preserve">A-11, F-04</w:t>
             </w:r>
           </w:p>
         </w:tc>
@@ -3926,19 +4565,18 @@
         <w:tc>
           <w:tcPr>
             <w:tcW w:type="dxa" w:w="1304"/>
-            <w:shd w:val="clear" w:color="auto" w:fill="FFF1C7"/>
-          </w:tcPr>
-          <w:p>
-            <w:pPr>
-              <w:pStyle w:val="Compact"/>
-              <w:spacing w:after="40"/>
-              <w:jc w:val="left"/>
-            </w:pPr>
-            <w:r>
-              <w:rPr>
-                <w:sz w:val="19"/>
-              </w:rPr>
-              <w:t xml:space="preserve">Da approvare</w:t>
+          </w:tcPr>
+          <w:p>
+            <w:pPr>
+              <w:pStyle w:val="Compact"/>
+              <w:spacing w:after="40"/>
+              <w:jc w:val="left"/>
+            </w:pPr>
+            <w:r>
+              <w:rPr>
+                <w:sz w:val="19"/>
+              </w:rPr>
+              <w:t xml:space="preserve">No</w:t>
             </w:r>
           </w:p>
         </w:tc>
@@ -3958,7 +4596,7 @@
               <w:rPr>
                 <w:sz w:val="19"/>
               </w:rPr>
-              <w:t xml:space="preserve">5</w:t>
+              <w:t xml:space="preserve">9</w:t>
             </w:r>
           </w:p>
         </w:tc>
@@ -3976,7 +4614,7 @@
               <w:rPr>
                 <w:sz w:val="19"/>
               </w:rPr>
-              <w:t xml:space="preserve">Three.js nuova versione (oggi r128)</w:t>
+              <w:t xml:space="preserve">Dati del server divisi per argomento</w:t>
             </w:r>
           </w:p>
         </w:tc>
@@ -3994,7 +4632,7 @@
               <w:rPr>
                 <w:sz w:val="19"/>
               </w:rPr>
-              <w:t xml:space="preserve">Cambiano colori e luci: vanno ricontrollate tutte le città con le foto</w:t>
+              <w:t xml:space="preserve">Un solo punto di passaggio rallenterebbe con molti giocatori</w:t>
             </w:r>
           </w:p>
         </w:tc>
@@ -4012,7 +4650,7 @@
               <w:rPr>
                 <w:sz w:val="19"/>
               </w:rPr>
-              <w:t xml:space="preserve">A-16</w:t>
+              <w:t xml:space="preserve">A-24</w:t>
             </w:r>
           </w:p>
         </w:tc>
@@ -4030,26 +4668,25 @@
               <w:rPr>
                 <w:sz w:val="19"/>
               </w:rPr>
-              <w:t xml:space="preserve">—</w:t>
+              <w:t xml:space="preserve">quando le misure lo chiedono</w:t>
             </w:r>
           </w:p>
         </w:tc>
         <w:tc>
           <w:tcPr>
             <w:tcW w:type="dxa" w:w="1304"/>
-            <w:shd w:val="clear" w:color="auto" w:fill="FFF1C7"/>
-          </w:tcPr>
-          <w:p>
-            <w:pPr>
-              <w:pStyle w:val="Compact"/>
-              <w:spacing w:after="40"/>
-              <w:jc w:val="left"/>
-            </w:pPr>
-            <w:r>
-              <w:rPr>
-                <w:sz w:val="19"/>
-              </w:rPr>
-              <w:t xml:space="preserve">Da approvare</w:t>
+          </w:tcPr>
+          <w:p>
+            <w:pPr>
+              <w:pStyle w:val="Compact"/>
+              <w:spacing w:after="40"/>
+              <w:jc w:val="left"/>
+            </w:pPr>
+            <w:r>
+              <w:rPr>
+                <w:sz w:val="19"/>
+              </w:rPr>
+              <w:t xml:space="preserve">No</w:t>
             </w:r>
           </w:p>
         </w:tc>
@@ -4069,7 +4706,7 @@
               <w:rPr>
                 <w:sz w:val="19"/>
               </w:rPr>
-              <w:t xml:space="preserve">6</w:t>
+              <w:t xml:space="preserve">10</w:t>
             </w:r>
           </w:p>
         </w:tc>
@@ -4087,26 +4724,7 @@
               <w:rPr>
                 <w:sz w:val="19"/>
               </w:rPr>
-              <w:t xml:space="preserve">La rete fuori da</w:t>
-            </w:r>
-            <w:r>
-              <w:rPr>
-                <w:sz w:val="19"/>
-              </w:rPr>
-              <w:t xml:space="preserve"> </w:t>
-            </w:r>
-            <w:r>
-              <w:rPr>
-                <w:rStyle w:val="VerbatimChar"/>
-                <w:sz w:val="19"/>
-              </w:rPr>
-              <w:t xml:space="preserve">game.js</w:t>
-            </w:r>
-            <w:r>
-              <w:rPr>
-                <w:sz w:val="19"/>
-              </w:rPr>
-              <w:t xml:space="preserve">, poi controllo contro chi bara sul server (la fisica è già in un modulo solo, A-19)</w:t>
+              <w:t xml:space="preserve">Parte comune C-Y-F per il secondo gioco, controllo dei tipi, interruttori per le novità</w:t>
             </w:r>
           </w:p>
         </w:tc>
@@ -4124,31 +4742,7 @@
               <w:rPr>
                 <w:sz w:val="19"/>
               </w:rPr>
-              <w:t xml:space="preserve">Serve alle classifiche e al link</w:t>
-            </w:r>
-            <w:r>
-              <w:rPr>
-                <w:sz w:val="19"/>
-              </w:rPr>
-              <w:t xml:space="preserve"> </w:t>
-            </w:r>
-            <w:r>
-              <w:rPr>
-                <w:sz w:val="19"/>
-              </w:rPr>
-              <w:t xml:space="preserve">“</w:t>
-            </w:r>
-            <w:r>
-              <w:rPr>
-                <w:sz w:val="19"/>
-              </w:rPr>
-              <w:t xml:space="preserve">batti il mio tempo</w:t>
-            </w:r>
-            <w:r>
-              <w:rPr>
-                <w:sz w:val="19"/>
-              </w:rPr>
-              <w:t xml:space="preserve">”</w:t>
+              <w:t xml:space="preserve">Il secondo gioco costa una frazione del primo</w:t>
             </w:r>
           </w:p>
         </w:tc>
@@ -4166,7 +4760,7 @@
               <w:rPr>
                 <w:sz w:val="19"/>
               </w:rPr>
-              <w:t xml:space="preserve">A-11, F-04</w:t>
+              <w:t xml:space="preserve">A-13, A-15, A-17</w:t>
             </w:r>
           </w:p>
         </w:tc>
@@ -4184,7 +4778,7 @@
               <w:rPr>
                 <w:sz w:val="19"/>
               </w:rPr>
-              <w:t xml:space="preserve">0.23</w:t>
+              <w:t xml:space="preserve">dopo</w:t>
             </w:r>
           </w:p>
         </w:tc>
@@ -4222,227 +4816,7 @@
               <w:rPr>
                 <w:sz w:val="19"/>
               </w:rPr>
-              <w:t xml:space="preserve">7</w:t>
-            </w:r>
-          </w:p>
-        </w:tc>
-        <w:tc>
-          <w:tcPr>
-            <w:tcW w:type="dxa" w:w="3175"/>
-          </w:tcPr>
-          <w:p>
-            <w:pPr>
-              <w:pStyle w:val="Compact"/>
-              <w:spacing w:after="40"/>
-              <w:jc w:val="left"/>
-            </w:pPr>
-            <w:r>
-              <w:rPr>
-                <w:sz w:val="19"/>
-              </w:rPr>
-              <w:t xml:space="preserve">Dati del server divisi per argomento</w:t>
-            </w:r>
-          </w:p>
-        </w:tc>
-        <w:tc>
-          <w:tcPr>
-            <w:tcW w:type="dxa" w:w="2494"/>
-          </w:tcPr>
-          <w:p>
-            <w:pPr>
-              <w:pStyle w:val="Compact"/>
-              <w:spacing w:after="40"/>
-              <w:jc w:val="left"/>
-            </w:pPr>
-            <w:r>
-              <w:rPr>
-                <w:sz w:val="19"/>
-              </w:rPr>
-              <w:t xml:space="preserve">Un solo punto di passaggio rallenterebbe con molti giocatori</w:t>
-            </w:r>
-          </w:p>
-        </w:tc>
-        <w:tc>
-          <w:tcPr>
-            <w:tcW w:type="dxa" w:w="1247"/>
-          </w:tcPr>
-          <w:p>
-            <w:pPr>
-              <w:pStyle w:val="Compact"/>
-              <w:spacing w:after="40"/>
-              <w:jc w:val="left"/>
-            </w:pPr>
-            <w:r>
-              <w:rPr>
-                <w:sz w:val="19"/>
-              </w:rPr>
-              <w:t xml:space="preserve">A-24</w:t>
-            </w:r>
-          </w:p>
-        </w:tc>
-        <w:tc>
-          <w:tcPr>
-            <w:tcW w:type="dxa" w:w="1134"/>
-          </w:tcPr>
-          <w:p>
-            <w:pPr>
-              <w:pStyle w:val="Compact"/>
-              <w:spacing w:after="40"/>
-              <w:jc w:val="left"/>
-            </w:pPr>
-            <w:r>
-              <w:rPr>
-                <w:sz w:val="19"/>
-              </w:rPr>
-              <w:t xml:space="preserve">quando le misure lo chiedono</w:t>
-            </w:r>
-          </w:p>
-        </w:tc>
-        <w:tc>
-          <w:tcPr>
-            <w:tcW w:type="dxa" w:w="1304"/>
-          </w:tcPr>
-          <w:p>
-            <w:pPr>
-              <w:pStyle w:val="Compact"/>
-              <w:spacing w:after="40"/>
-              <w:jc w:val="left"/>
-            </w:pPr>
-            <w:r>
-              <w:rPr>
-                <w:sz w:val="19"/>
-              </w:rPr>
-              <w:t xml:space="preserve">No</w:t>
-            </w:r>
-          </w:p>
-        </w:tc>
-      </w:tr>
-      <w:tr>
-        <w:tc>
-          <w:tcPr>
-            <w:tcW w:type="dxa" w:w="510"/>
-          </w:tcPr>
-          <w:p>
-            <w:pPr>
-              <w:pStyle w:val="Compact"/>
-              <w:spacing w:after="40"/>
-              <w:jc w:val="left"/>
-            </w:pPr>
-            <w:r>
-              <w:rPr>
-                <w:sz w:val="19"/>
-              </w:rPr>
-              <w:t xml:space="preserve">8</w:t>
-            </w:r>
-          </w:p>
-        </w:tc>
-        <w:tc>
-          <w:tcPr>
-            <w:tcW w:type="dxa" w:w="3175"/>
-          </w:tcPr>
-          <w:p>
-            <w:pPr>
-              <w:pStyle w:val="Compact"/>
-              <w:spacing w:after="40"/>
-              <w:jc w:val="left"/>
-            </w:pPr>
-            <w:r>
-              <w:rPr>
-                <w:sz w:val="19"/>
-              </w:rPr>
-              <w:t xml:space="preserve">Parte comune C-Y-F per il secondo gioco, controllo dei tipi, interruttori per le novità</w:t>
-            </w:r>
-          </w:p>
-        </w:tc>
-        <w:tc>
-          <w:tcPr>
-            <w:tcW w:type="dxa" w:w="2494"/>
-          </w:tcPr>
-          <w:p>
-            <w:pPr>
-              <w:pStyle w:val="Compact"/>
-              <w:spacing w:after="40"/>
-              <w:jc w:val="left"/>
-            </w:pPr>
-            <w:r>
-              <w:rPr>
-                <w:sz w:val="19"/>
-              </w:rPr>
-              <w:t xml:space="preserve">Il secondo gioco costa una frazione del primo</w:t>
-            </w:r>
-          </w:p>
-        </w:tc>
-        <w:tc>
-          <w:tcPr>
-            <w:tcW w:type="dxa" w:w="1247"/>
-          </w:tcPr>
-          <w:p>
-            <w:pPr>
-              <w:pStyle w:val="Compact"/>
-              <w:spacing w:after="40"/>
-              <w:jc w:val="left"/>
-            </w:pPr>
-            <w:r>
-              <w:rPr>
-                <w:sz w:val="19"/>
-              </w:rPr>
-              <w:t xml:space="preserve">A-13, A-15, A-17</w:t>
-            </w:r>
-          </w:p>
-        </w:tc>
-        <w:tc>
-          <w:tcPr>
-            <w:tcW w:type="dxa" w:w="1134"/>
-          </w:tcPr>
-          <w:p>
-            <w:pPr>
-              <w:pStyle w:val="Compact"/>
-              <w:spacing w:after="40"/>
-              <w:jc w:val="left"/>
-            </w:pPr>
-            <w:r>
-              <w:rPr>
-                <w:sz w:val="19"/>
-              </w:rPr>
-              <w:t xml:space="preserve">dopo</w:t>
-            </w:r>
-          </w:p>
-        </w:tc>
-        <w:tc>
-          <w:tcPr>
-            <w:tcW w:type="dxa" w:w="1304"/>
-          </w:tcPr>
-          <w:p>
-            <w:pPr>
-              <w:pStyle w:val="Compact"/>
-              <w:spacing w:after="40"/>
-              <w:jc w:val="left"/>
-            </w:pPr>
-            <w:r>
-              <w:rPr>
-                <w:sz w:val="19"/>
-              </w:rPr>
-              <w:t xml:space="preserve">No</w:t>
-            </w:r>
-          </w:p>
-        </w:tc>
-      </w:tr>
-      <w:tr>
-        <w:tc>
-          <w:tcPr>
-            <w:tcW w:type="dxa" w:w="510"/>
-          </w:tcPr>
-          <w:p>
-            <w:pPr>
-              <w:pStyle w:val="Compact"/>
-              <w:spacing w:after="40"/>
-              <w:jc w:val="left"/>
-            </w:pPr>
-            <w:r>
-              <w:rPr>
-                <w:sz w:val="19"/>
-              </w:rPr>
-              <w:t xml:space="preserve">9</w:t>
+              <w:t xml:space="preserve">11</w:t>
             </w:r>
           </w:p>
         </w:tc>
@@ -5394,13 +5768,13 @@
       </w:tr>
     </w:tbl>
     <w:bookmarkEnd w:id="24"/>
-    <w:bookmarkStart w:id="25" w:name="documentazione"/>
+    <w:bookmarkStart w:id="25" w:name="grafica-e-qualità"/>
     <w:p>
       <w:pPr>
         <w:pStyle w:val="Heading1"/>
       </w:pPr>
       <w:r>
-        <w:t xml:space="preserve">6. Documentazione</w:t>
+        <w:t xml:space="preserve">5. Grafica e qualità</w:t>
       </w:r>
     </w:p>
     <w:tbl>
@@ -5551,7 +5925,7 @@
               <w:rPr>
                 <w:sz w:val="19"/>
               </w:rPr>
-              <w:t xml:space="preserve">R-510</w:t>
+              <w:t xml:space="preserve">R-513</w:t>
             </w:r>
           </w:p>
         </w:tc>
@@ -5569,7 +5943,31 @@
               <w:rPr>
                 <w:sz w:val="19"/>
               </w:rPr>
-              <w:t xml:space="preserve">Il software deve crescere senza rallentare; la struttura la sceglie Claude</w:t>
+              <w:t xml:space="preserve">Migliorare la grafica degli scenari fino al livello 2 (</w:t>
+            </w:r>
+            <w:r>
+              <w:rPr>
+                <w:sz w:val="19"/>
+              </w:rPr>
+              <w:t xml:space="preserve">“</w:t>
+            </w:r>
+            <w:r>
+              <w:rPr>
+                <w:sz w:val="19"/>
+              </w:rPr>
+              <w:t xml:space="preserve">stilizzato curato</w:t>
+            </w:r>
+            <w:r>
+              <w:rPr>
+                <w:sz w:val="19"/>
+              </w:rPr>
+              <w:t xml:space="preserve">”</w:t>
+            </w:r>
+            <w:r>
+              <w:rPr>
+                <w:sz w:val="19"/>
+              </w:rPr>
+              <w:t xml:space="preserve">, come un buon gioco per telefono), cominciando dallo sfondo</w:t>
             </w:r>
           </w:p>
         </w:tc>
@@ -5587,26 +5985,26 @@
               <w:rPr>
                 <w:sz w:val="19"/>
               </w:rPr>
-              <w:t xml:space="preserve">26/10/2026</w:t>
+              <w:t xml:space="preserve">27/10/2026</w:t>
             </w:r>
           </w:p>
         </w:tc>
         <w:tc>
           <w:tcPr>
             <w:tcW w:type="dxa" w:w="1134"/>
-            <w:shd w:val="clear" w:color="auto" w:fill="FFF1C7"/>
-          </w:tcPr>
-          <w:p>
-            <w:pPr>
-              <w:pStyle w:val="Compact"/>
-              <w:spacing w:after="40"/>
-              <w:jc w:val="left"/>
-            </w:pPr>
-            <w:r>
-              <w:rPr>
-                <w:sz w:val="19"/>
-              </w:rPr>
-              <w:t xml:space="preserve">In corso</w:t>
+            <w:shd w:val="clear" w:color="auto" w:fill="FDE2D6"/>
+          </w:tcPr>
+          <w:p>
+            <w:pPr>
+              <w:pStyle w:val="Compact"/>
+              <w:spacing w:after="40"/>
+              <w:jc w:val="left"/>
+            </w:pPr>
+            <w:r>
+              <w:rPr>
+                <w:sz w:val="19"/>
+              </w:rPr>
+              <w:t xml:space="preserve">Da fare</w:t>
             </w:r>
           </w:p>
         </w:tc>
@@ -5624,14 +6022,303 @@
               <w:rPr>
                 <w:sz w:val="19"/>
               </w:rPr>
-              <w:t xml:space="preserve">Scelta S-43; piano nella sezione 11 e nei prossimi passi (A-14, A-23, A-25, A-11…)</w:t>
+              <w:t xml:space="preserve">Scelta di Luigi del 27/10 sera tra 4 livelli (1 oggi; 2 stilizzato curato; 3 modelli 3D veri città per città; 4 quasi realistico, sconsigliato: su Android WebGPU c’è solo da Android 12 in su e i telefoni si scaldano).</w:t>
+            </w:r>
+            <w:r>
+              <w:rPr>
+                <w:sz w:val="19"/>
+              </w:rPr>
+              <w:t xml:space="preserve"> </w:t>
+            </w:r>
+            <w:r>
+              <w:rPr>
+                <w:bCs/>
+                <w:b/>
+                <w:sz w:val="19"/>
+              </w:rPr>
+              <w:t xml:space="preserve">Prima parte, lo sfondo:</w:t>
+            </w:r>
+            <w:r>
+              <w:rPr>
+                <w:sz w:val="19"/>
+              </w:rPr>
+              <w:t xml:space="preserve"> </w:t>
+            </w:r>
+            <w:r>
+              <w:rPr>
+                <w:sz w:val="19"/>
+              </w:rPr>
+              <w:t xml:space="preserve">(1) cielo con nuvole dipinte su due strati che scorrono piano, sole con alone morbido, colori del cielo coerenti con la cartolina di ogni città; (2) cartolina in profondità: ogni città divisa in 2-3 piani a distanze diverse (lontano monti e colline, in mezzo la città, davanti il monumento), così quando la strada curva o il rider si sposta i piani scorrono a velocità diverse e lo sfondo ha profondità; (3) luce coerente: i palazzi e il monumento sono illuminati dalla parte del sole del cielo; (4) nessuna linea netta tra pista e sfondo: suolo lontano, nebbia della pista e foschia della cartolina sfumano l’uno nell’altro; (5) anche la Neve con uno sfondo dipinto a più piani (cime con ghiacciai, boschi, valle); (6) piccoli movimenti: nuvole, uccelli lontani, acqua che luccica dove c’è il mare o il fiume. Limiti: al massimo 3 oggetti da disegnare in più per lo sfondo; memoria della scheda video per lo sfondo di una città ≤ 16 MB sul PC e ≤ 6 MB sul telefono; si dipinge nel worker come oggi (R-405); nessun fotogramma perso (lo misura A-14).</w:t>
+            </w:r>
+            <w:r>
+              <w:rPr>
+                <w:sz w:val="19"/>
+              </w:rPr>
+              <w:t xml:space="preserve"> </w:t>
+            </w:r>
+            <w:r>
+              <w:rPr>
+                <w:bCs/>
+                <w:b/>
+                <w:sz w:val="19"/>
+              </w:rPr>
+              <w:t xml:space="preserve">Seconda parte, il resto della scena:</w:t>
+            </w:r>
+            <w:r>
+              <w:rPr>
+                <w:sz w:val="19"/>
+              </w:rPr>
+              <w:t xml:space="preserve"> </w:t>
+            </w:r>
+            <w:r>
+              <w:rPr>
+                <w:sz w:val="19"/>
+              </w:rPr>
+              <w:t xml:space="preserve">Three.js nuovo (A-16), correzione di luce e colore (tone mapping ACES) e colori di ogni città, luce morbida con le ombre di contatto dipinte nei modelli, alberi e palazzi più fitti con l’instancing, polvere di neve e scia, neve e asfalto con rilievo; gli effetti più pesanti (bagliore, vignetta) solo dove il dispositivo regge, con la qualità scelta in automatico (A-14)</w:t>
             </w:r>
           </w:p>
         </w:tc>
       </w:tr>
     </w:tbl>
     <w:bookmarkEnd w:id="25"/>
-    <w:bookmarkStart w:id="26" w:name="scelte-fatte-da-claude-da-confermare"/>
+    <w:bookmarkStart w:id="26" w:name="documentazione"/>
+    <w:p>
+      <w:pPr>
+        <w:pStyle w:val="Heading1"/>
+      </w:pPr>
+      <w:r>
+        <w:t xml:space="preserve">6. Documentazione</w:t>
+      </w:r>
+    </w:p>
+    <w:tbl>
+      <w:tblPr>
+        <w:tblStyle w:val="Table"/>
+        <w:tblLook w:firstRow="1" w:lastRow="0" w:firstColumn="0" w:lastColumn="0" w:noHBand="0" w:noVBand="0" w:val="0020"/>
+        <w:jc w:val="start"/>
+        <w:tblBorders>
+          <w:top w:val="single" w:sz="4" w:color="B8C4D2"/>
+          <w:left w:val="single" w:sz="4" w:color="B8C4D2"/>
+          <w:bottom w:val="single" w:sz="4" w:color="B8C4D2"/>
+          <w:right w:val="single" w:sz="4" w:color="B8C4D2"/>
+          <w:insideH w:val="single" w:sz="4" w:color="B8C4D2"/>
+          <w:insideV w:val="single" w:sz="4" w:color="B8C4D2"/>
+        </w:tblBorders>
+        <w:tblW w:w="9865" w:type="dxa"/>
+        <w:tblLayout w:type="fixed"/>
+      </w:tblPr>
+      <w:tblGrid>
+        <w:gridCol w:w="907"/>
+        <w:gridCol w:w="4195"/>
+        <w:gridCol w:w="1134"/>
+        <w:gridCol w:w="1134"/>
+        <w:gridCol w:w="2494"/>
+      </w:tblGrid>
+      <w:tr>
+        <w:trPr>
+          <w:tblHeader w:val="true"/>
+        </w:trPr>
+        <w:tc>
+          <w:tcPr>
+            <w:tcW w:type="dxa" w:w="907"/>
+            <w:shd w:val="clear" w:color="auto" w:fill="13233A"/>
+          </w:tcPr>
+          <w:p>
+            <w:pPr>
+              <w:pStyle w:val="Compact"/>
+              <w:spacing w:after="40"/>
+              <w:jc w:val="left"/>
+            </w:pPr>
+            <w:r>
+              <w:rPr>
+                <w:b/>
+                <w:color w:val="FFFFFF"/>
+                <w:sz w:val="19"/>
+              </w:rPr>
+              <w:t xml:space="preserve">ID</w:t>
+            </w:r>
+          </w:p>
+        </w:tc>
+        <w:tc>
+          <w:tcPr>
+            <w:tcW w:type="dxa" w:w="4195"/>
+            <w:shd w:val="clear" w:color="auto" w:fill="13233A"/>
+          </w:tcPr>
+          <w:p>
+            <w:pPr>
+              <w:pStyle w:val="Compact"/>
+              <w:spacing w:after="40"/>
+              <w:jc w:val="left"/>
+            </w:pPr>
+            <w:r>
+              <w:rPr>
+                <w:b/>
+                <w:color w:val="FFFFFF"/>
+                <w:sz w:val="19"/>
+              </w:rPr>
+              <w:t xml:space="preserve">Richiesta</w:t>
+            </w:r>
+          </w:p>
+        </w:tc>
+        <w:tc>
+          <w:tcPr>
+            <w:tcW w:type="dxa" w:w="1134"/>
+            <w:shd w:val="clear" w:color="auto" w:fill="13233A"/>
+          </w:tcPr>
+          <w:p>
+            <w:pPr>
+              <w:pStyle w:val="Compact"/>
+              <w:spacing w:after="40"/>
+              <w:jc w:val="left"/>
+            </w:pPr>
+            <w:r>
+              <w:rPr>
+                <w:b/>
+                <w:color w:val="FFFFFF"/>
+                <w:sz w:val="19"/>
+              </w:rPr>
+              <w:t xml:space="preserve">Data</w:t>
+            </w:r>
+          </w:p>
+        </w:tc>
+        <w:tc>
+          <w:tcPr>
+            <w:tcW w:type="dxa" w:w="1134"/>
+            <w:shd w:val="clear" w:color="auto" w:fill="13233A"/>
+          </w:tcPr>
+          <w:p>
+            <w:pPr>
+              <w:pStyle w:val="Compact"/>
+              <w:spacing w:after="40"/>
+              <w:jc w:val="left"/>
+            </w:pPr>
+            <w:r>
+              <w:rPr>
+                <w:b/>
+                <w:color w:val="FFFFFF"/>
+                <w:sz w:val="19"/>
+              </w:rPr>
+              <w:t xml:space="preserve">Stato</w:t>
+            </w:r>
+          </w:p>
+        </w:tc>
+        <w:tc>
+          <w:tcPr>
+            <w:tcW w:type="dxa" w:w="2494"/>
+            <w:shd w:val="clear" w:color="auto" w:fill="13233A"/>
+          </w:tcPr>
+          <w:p>
+            <w:pPr>
+              <w:pStyle w:val="Compact"/>
+              <w:spacing w:after="40"/>
+              <w:jc w:val="left"/>
+            </w:pPr>
+            <w:r>
+              <w:rPr>
+                <w:b/>
+                <w:color w:val="FFFFFF"/>
+                <w:sz w:val="19"/>
+              </w:rPr>
+              <w:t xml:space="preserve">Come funziona oggi</w:t>
+            </w:r>
+          </w:p>
+        </w:tc>
+      </w:tr>
+      <w:tr>
+        <w:tc>
+          <w:tcPr>
+            <w:tcW w:type="dxa" w:w="907"/>
+          </w:tcPr>
+          <w:p>
+            <w:pPr>
+              <w:pStyle w:val="Compact"/>
+              <w:spacing w:after="40"/>
+              <w:jc w:val="left"/>
+            </w:pPr>
+            <w:r>
+              <w:rPr>
+                <w:sz w:val="19"/>
+              </w:rPr>
+              <w:t xml:space="preserve">R-510</w:t>
+            </w:r>
+          </w:p>
+        </w:tc>
+        <w:tc>
+          <w:tcPr>
+            <w:tcW w:type="dxa" w:w="4195"/>
+          </w:tcPr>
+          <w:p>
+            <w:pPr>
+              <w:pStyle w:val="Compact"/>
+              <w:spacing w:after="40"/>
+              <w:jc w:val="left"/>
+            </w:pPr>
+            <w:r>
+              <w:rPr>
+                <w:sz w:val="19"/>
+              </w:rPr>
+              <w:t xml:space="preserve">Il software deve crescere senza rallentare; la struttura la sceglie Claude</w:t>
+            </w:r>
+          </w:p>
+        </w:tc>
+        <w:tc>
+          <w:tcPr>
+            <w:tcW w:type="dxa" w:w="1134"/>
+          </w:tcPr>
+          <w:p>
+            <w:pPr>
+              <w:pStyle w:val="Compact"/>
+              <w:spacing w:after="40"/>
+              <w:jc w:val="left"/>
+            </w:pPr>
+            <w:r>
+              <w:rPr>
+                <w:sz w:val="19"/>
+              </w:rPr>
+              <w:t xml:space="preserve">26/10/2026</w:t>
+            </w:r>
+          </w:p>
+        </w:tc>
+        <w:tc>
+          <w:tcPr>
+            <w:tcW w:type="dxa" w:w="1134"/>
+            <w:shd w:val="clear" w:color="auto" w:fill="FFF1C7"/>
+          </w:tcPr>
+          <w:p>
+            <w:pPr>
+              <w:pStyle w:val="Compact"/>
+              <w:spacing w:after="40"/>
+              <w:jc w:val="left"/>
+            </w:pPr>
+            <w:r>
+              <w:rPr>
+                <w:sz w:val="19"/>
+              </w:rPr>
+              <w:t xml:space="preserve">In corso</w:t>
+            </w:r>
+          </w:p>
+        </w:tc>
+        <w:tc>
+          <w:tcPr>
+            <w:tcW w:type="dxa" w:w="2494"/>
+          </w:tcPr>
+          <w:p>
+            <w:pPr>
+              <w:pStyle w:val="Compact"/>
+              <w:spacing w:after="40"/>
+              <w:jc w:val="left"/>
+            </w:pPr>
+            <w:r>
+              <w:rPr>
+                <w:sz w:val="19"/>
+              </w:rPr>
+              <w:t xml:space="preserve">Scelta S-43; piano nella sezione 11 e nei prossimi passi (A-14, A-23, A-25, A-11…)</w:t>
+            </w:r>
+          </w:p>
+        </w:tc>
+      </w:tr>
+    </w:tbl>
+    <w:bookmarkEnd w:id="26"/>
+    <w:bookmarkStart w:id="27" w:name="scelte-fatte-da-claude-da-confermare"/>
     <w:p>
       <w:pPr>
         <w:pStyle w:val="Heading1"/>
@@ -11066,8 +11753,8 @@
         </w:tc>
       </w:tr>
     </w:tbl>
-    <w:bookmarkEnd w:id="26"/>
-    <w:bookmarkStart w:id="27" w:name="idee-per-il-futuro-da-confermare"/>
+    <w:bookmarkEnd w:id="27"/>
+    <w:bookmarkStart w:id="28" w:name="idee-per-il-futuro-da-confermare"/>
     <w:p>
       <w:pPr>
         <w:pStyle w:val="Heading1"/>
@@ -12132,8 +12819,8 @@
         </w:tc>
       </w:tr>
     </w:tbl>
-    <w:bookmarkEnd w:id="27"/>
-    <w:bookmarkStart w:id="28" w:name="da-fare"/>
+    <w:bookmarkEnd w:id="28"/>
+    <w:bookmarkStart w:id="29" w:name="da-fare"/>
     <w:p>
       <w:pPr>
         <w:pStyle w:val="Heading1"/>
@@ -12854,8 +13541,8 @@
         </w:tc>
       </w:tr>
     </w:tbl>
-    <w:bookmarkEnd w:id="28"/>
-    <w:bookmarkStart w:id="29" w:name="X38ada45128bb1909ebb68cbfba9bfaa8c77a6fa"/>
+    <w:bookmarkEnd w:id="29"/>
+    <w:bookmarkStart w:id="30" w:name="X38ada45128bb1909ebb68cbfba9bfaa8c77a6fa"/>
     <w:p>
       <w:pPr>
         <w:pStyle w:val="Heading1"/>
@@ -14491,7 +15178,7 @@
               <w:rPr>
                 <w:sz w:val="19"/>
               </w:rPr>
-              <w:t xml:space="preserve">fps, peso della pagina e tempo di caricamento misurati a ogni giro, con soglie: il cancello si chiude se una modifica rende il gioco più lento</w:t>
+              <w:t xml:space="preserve">fps, peso della pagina e tempo di caricamento misurati a ogni giro, con soglie: il cancello si chiude se una modifica rende il gioco più lento Approvato da Luigi il 27/10 sera con il livello 2 della grafica (R-513): in più gli fps veri dei giocatori su /api/stats e la qualità scelta in automatico in base al dispositivo.</w:t>
             </w:r>
           </w:p>
         </w:tc>
@@ -14709,7 +15396,7 @@
               <w:rPr>
                 <w:sz w:val="19"/>
               </w:rPr>
-              <w:t xml:space="preserve">, licenza MIT), niente più CDN esterno; l’aggiornamento a una versione nuova resta da fare. Oggi si usa la r128 (2021) da un CDN esterno: se il CDN ha un problema, il gioco non parte. Va fatto dopo A-11, con le foto delle città per confrontare prima e dopo</w:t>
+              <w:t xml:space="preserve">, licenza MIT), niente più CDN esterno; l’aggiornamento a una versione nuova resta da fare. Oggi si usa la r128 (2021) da un CDN esterno: se il CDN ha un problema, il gioco non parte. Va fatto dopo A-11, con le foto delle città per confrontare prima e dopo Approvato da Luigi il 27/10 sera con il livello 2 della grafica (R-513); l’ultima versione è la r186 (settembre 2026).</w:t>
             </w:r>
           </w:p>
         </w:tc>
@@ -15231,8 +15918,8 @@
         <w:t xml:space="preserve">in locale o il cancello su GitHub.</w:t>
       </w:r>
     </w:p>
-    <w:bookmarkEnd w:id="29"/>
-    <w:bookmarkStart w:id="30" w:name="Xcc9d507ef18e501e5663cfd7b84fe1676e9ab59"/>
+    <w:bookmarkEnd w:id="30"/>
+    <w:bookmarkStart w:id="31" w:name="Xcc9d507ef18e501e5663cfd7b84fe1676e9ab59"/>
     <w:p>
       <w:pPr>
         <w:pStyle w:val="Heading1"/>
@@ -18423,8 +19110,8 @@
         </w:tc>
       </w:tr>
     </w:tbl>
-    <w:bookmarkEnd w:id="30"/>
-    <w:bookmarkStart w:id="31" w:name="X3cf251cf2a7fc009966e540b1607b078fce84ba"/>
+    <w:bookmarkEnd w:id="31"/>
+    <w:bookmarkStart w:id="32" w:name="X3cf251cf2a7fc009966e540b1607b078fce84ba"/>
     <w:p>
       <w:pPr>
         <w:pStyle w:val="Heading1"/>
@@ -19621,7 +20308,7 @@
         </w:tc>
       </w:tr>
     </w:tbl>
-    <w:bookmarkEnd w:id="31"/>
+    <w:bookmarkEnd w:id="32"/>
     <w:sectPr>
       <w:pgMar w:left="1020" w:right="1020" w:top="1020" w:bottom="1020"/>
     </w:sectPr>

</xml_diff>

<commit_message>
Requisiti: riga 1d con il percorso giusto (ambiente cloud, Network access Custom), non Impostazioni → Capabilities
Co-Authored-By: Claude Opus 5.5 <noreply@anthropic.com>
Claude-Session: https://claude.ai/code/session_017ipzp9sqryzfFBJaHpW6iC
</commit_message>
<xml_diff>
--- a/docs/CYF-Gaming-Requisiti-da-Implementare-o-Bachi.docx
+++ b/docs/CYF-Gaming-Requisiti-da-Implementare-o-Bachi.docx
@@ -1103,7 +1103,93 @@
               <w:rPr>
                 <w:sz w:val="19"/>
               </w:rPr>
-              <w:t xml:space="preserve">Permettere al turno di notte di leggere il sito online: su claude.ai → Settings → Capabilities aggiungere il dominio</w:t>
+              <w:t xml:space="preserve">Permettere al turno di notte di leggere il sito online: su claude.ai/code, selettore dell’ambiente sotto la casella del messaggio → sotto</w:t>
+            </w:r>
+            <w:r>
+              <w:rPr>
+                <w:sz w:val="19"/>
+              </w:rPr>
+              <w:t xml:space="preserve"> </w:t>
+            </w:r>
+            <w:r>
+              <w:rPr>
+                <w:bCs/>
+                <w:b/>
+                <w:sz w:val="19"/>
+              </w:rPr>
+              <w:t xml:space="preserve">Cloud</w:t>
+            </w:r>
+            <w:r>
+              <w:rPr>
+                <w:sz w:val="19"/>
+              </w:rPr>
+              <w:t xml:space="preserve"> </w:t>
+            </w:r>
+            <w:r>
+              <w:rPr>
+                <w:sz w:val="19"/>
+              </w:rPr>
+              <w:t xml:space="preserve">l’ambiente usato (di solito</w:t>
+            </w:r>
+            <w:r>
+              <w:rPr>
+                <w:sz w:val="19"/>
+              </w:rPr>
+              <w:t xml:space="preserve"> </w:t>
+            </w:r>
+            <w:r>
+              <w:rPr>
+                <w:bCs/>
+                <w:b/>
+                <w:sz w:val="19"/>
+              </w:rPr>
+              <w:t xml:space="preserve">Default</w:t>
+            </w:r>
+            <w:r>
+              <w:rPr>
+                <w:sz w:val="19"/>
+              </w:rPr>
+              <w:t xml:space="preserve">) → icona delle impostazioni →</w:t>
+            </w:r>
+            <w:r>
+              <w:rPr>
+                <w:sz w:val="19"/>
+              </w:rPr>
+              <w:t xml:space="preserve"> </w:t>
+            </w:r>
+            <w:r>
+              <w:rPr>
+                <w:bCs/>
+                <w:b/>
+                <w:sz w:val="19"/>
+              </w:rPr>
+              <w:t xml:space="preserve">Network access: Custom</w:t>
+            </w:r>
+            <w:r>
+              <w:rPr>
+                <w:sz w:val="19"/>
+              </w:rPr>
+              <w:t xml:space="preserve"> </w:t>
+            </w:r>
+            <w:r>
+              <w:rPr>
+                <w:sz w:val="19"/>
+              </w:rPr>
+              <w:t xml:space="preserve">→ in</w:t>
+            </w:r>
+            <w:r>
+              <w:rPr>
+                <w:sz w:val="19"/>
+              </w:rPr>
+              <w:t xml:space="preserve"> </w:t>
+            </w:r>
+            <w:r>
+              <w:rPr>
+                <w:bCs/>
+                <w:b/>
+                <w:sz w:val="19"/>
+              </w:rPr>
+              <w:t xml:space="preserve">Allowed domains</w:t>
             </w:r>
             <w:r>
               <w:rPr>
@@ -1128,7 +1214,43 @@
               <w:rPr>
                 <w:sz w:val="19"/>
               </w:rPr>
-              <w:t xml:space="preserve">tra quelli consentiti. Stanotte (28/10) errori dei telefoni e misure non erano leggibili dal cloud</w:t>
+              <w:t xml:space="preserve">→ spuntare</w:t>
+            </w:r>
+            <w:r>
+              <w:rPr>
+                <w:sz w:val="19"/>
+              </w:rPr>
+              <w:t xml:space="preserve"> </w:t>
+            </w:r>
+            <w:r>
+              <w:rPr>
+                <w:sz w:val="19"/>
+              </w:rPr>
+              <w:t xml:space="preserve">“</w:t>
+            </w:r>
+            <w:r>
+              <w:rPr>
+                <w:sz w:val="19"/>
+              </w:rPr>
+              <w:t xml:space="preserve">Also include default</w:t>
+            </w:r>
+            <w:r>
+              <w:rPr>
+                <w:sz w:val="19"/>
+              </w:rPr>
+              <w:t xml:space="preserve">”</w:t>
+            </w:r>
+            <w:r>
+              <w:rPr>
+                <w:sz w:val="19"/>
+              </w:rPr>
+              <w:t xml:space="preserve"> </w:t>
+            </w:r>
+            <w:r>
+              <w:rPr>
+                <w:sz w:val="19"/>
+              </w:rPr>
+              <w:t xml:space="preserve">→ salvare. Non è Impostazioni → Capabilities (indicazione sbagliata corretta il 28/10). Stanotte (28/10) errori dei telefoni e misure non erano leggibili dal cloud</w:t>
             </w:r>
           </w:p>
         </w:tc>

</xml_diff>

<commit_message>
Requisiti: righe 1h, 1i, 1j di Luigi aggiornate ai ripieghi applicati (S-53, S-54) e ore del turno; Word rigenerati
Co-Authored-By: Claude Fable 5.1 <noreply@anthropic.com>
Claude-Session: https://claude.ai/code/session_01Xy4XstPL8Mfcy49jRPwYXw
</commit_message>
<xml_diff>
--- a/docs/CYF-Gaming-Requisiti-da-Implementare-o-Bachi.docx
+++ b/docs/CYF-Gaming-Requisiti-da-Implementare-o-Bachi.docx
@@ -1155,7 +1155,7 @@
           <w:bCs/>
           <w:b/>
         </w:rPr>
-        <w:t xml:space="preserve">0.25.7; senza prove, solo controlli statici)</w:t>
+        <w:t xml:space="preserve">0.25.7; senza prove, solo controlli statici; dall’1:01 alle 1:45 circa, orologio della sessione)</w:t>
       </w:r>
       <w:r>
         <w:t xml:space="preserve">: fatto, in ordine:</w:t>
@@ -4195,7 +4195,27 @@
               <w:rPr>
                 <w:sz w:val="19"/>
               </w:rPr>
-              <w:t xml:space="preserve">(uguale alla banana: ferma 4 s invece di 2), oppure un altro numero. Se non rispondi entro l’1:00 resta 1.500</w:t>
+              <w:t xml:space="preserve">(uguale alla banana: ferma 4 s invece di 2), oppure un altro numero. Non hai risposto entro l’1:00 del 29/10: nella 0.27.0 è</w:t>
+            </w:r>
+            <w:r>
+              <w:rPr>
+                <w:sz w:val="19"/>
+              </w:rPr>
+              <w:t xml:space="preserve"> </w:t>
+            </w:r>
+            <w:r>
+              <w:rPr>
+                <w:bCs/>
+                <w:b/>
+                <w:sz w:val="19"/>
+              </w:rPr>
+              <w:t xml:space="preserve">1.500 fisso</w:t>
+            </w:r>
+            <w:r>
+              <w:rPr>
+                <w:sz w:val="19"/>
+              </w:rPr>
+              <w:t xml:space="preserve">; se vuoi un altro numero basta dirlo</w:t>
             </w:r>
           </w:p>
         </w:tc>
@@ -4289,7 +4309,33 @@
               <w:rPr>
                 <w:sz w:val="19"/>
               </w:rPr>
-              <w:t xml:space="preserve">: costi sui pulsanti (🍌 1500, 💣 50), con ← o → premuto o in aria la banana lanciata non ti ferma (</w:t>
+              <w:t xml:space="preserve"> </w:t>
+            </w:r>
+            <w:r>
+              <w:rPr>
+                <w:sz w:val="19"/>
+              </w:rPr>
+              <w:t xml:space="preserve">e l’</w:t>
+            </w:r>
+            <w:r>
+              <w:rPr>
+                <w:bCs/>
+                <w:b/>
+                <w:sz w:val="19"/>
+              </w:rPr>
+              <w:t xml:space="preserve">allenamento</w:t>
+            </w:r>
+            <w:r>
+              <w:rPr>
+                <w:sz w:val="19"/>
+              </w:rPr>
+              <w:t xml:space="preserve"> </w:t>
+            </w:r>
+            <w:r>
+              <w:rPr>
+                <w:sz w:val="19"/>
+              </w:rPr>
+              <w:t xml:space="preserve">(R-519: via 3-2-1, traguardo a 2 km, risultati con Ricomincia): costi sui pulsanti (🍌 1500, 💣 50), con ← o → premuto o in aria la banana lanciata non ti ferma (</w:t>
             </w:r>
             <w:r>
               <w:rPr>
@@ -4475,7 +4521,27 @@
               <w:rPr>
                 <w:sz w:val="19"/>
               </w:rPr>
-              <w:t xml:space="preserve">), senza vite come in gara. Basta</w:t>
+              <w:t xml:space="preserve">), senza vite come in gara. Non hai risposto entro l’1:00 del 29/10: nella 0.28.0 l’allenamento è</w:t>
+            </w:r>
+            <w:r>
+              <w:rPr>
+                <w:sz w:val="19"/>
+              </w:rPr>
+              <w:t xml:space="preserve"> </w:t>
+            </w:r>
+            <w:r>
+              <w:rPr>
+                <w:bCs/>
+                <w:b/>
+                <w:sz w:val="19"/>
+              </w:rPr>
+              <w:t xml:space="preserve">senza vite</w:t>
+            </w:r>
+            <w:r>
+              <w:rPr>
+                <w:sz w:val="19"/>
+              </w:rPr>
+              <w:t xml:space="preserve">, come in gara; basta</w:t>
             </w:r>
             <w:r>
               <w:rPr>
@@ -4493,7 +4559,7 @@
               <w:rPr>
                 <w:sz w:val="19"/>
               </w:rPr>
-              <w:t xml:space="preserve">R-519 senza vite</w:t>
+              <w:t xml:space="preserve">R-519 con le vite</w:t>
             </w:r>
             <w:r>
               <w:rPr>
@@ -4511,31 +4577,7 @@
               <w:rPr>
                 <w:sz w:val="19"/>
               </w:rPr>
-              <w:t xml:space="preserve">o</w:t>
-            </w:r>
-            <w:r>
-              <w:rPr>
-                <w:sz w:val="19"/>
-              </w:rPr>
-              <w:t xml:space="preserve"> </w:t>
-            </w:r>
-            <w:r>
-              <w:rPr>
-                <w:sz w:val="19"/>
-              </w:rPr>
-              <w:t xml:space="preserve">“</w:t>
-            </w:r>
-            <w:r>
-              <w:rPr>
-                <w:sz w:val="19"/>
-              </w:rPr>
-              <w:t xml:space="preserve">R-519 con le vite</w:t>
-            </w:r>
-            <w:r>
-              <w:rPr>
-                <w:sz w:val="19"/>
-              </w:rPr>
-              <w:t xml:space="preserve">”</w:t>
+              <w:t xml:space="preserve">per rimetterle</w:t>
             </w:r>
           </w:p>
         </w:tc>

</xml_diff>